<commit_message>
Update binary file: Assessment — Tasks 1, 3, 4.docx
The binary file "Assessment — Tasks 1, 3, 4.docx" was modified. Specific content changes are not visible, but the file itself has changed.
</commit_message>
<xml_diff>
--- a/Assessment — Tasks 1, 3, 4.docx
+++ b/Assessment — Tasks 1, 3, 4.docx
@@ -45,8 +45,6 @@
           <w:bottom w:val="single" w:color="E2E8F0" w:sz="6" w:space="1"/>
         </w:pBdr>
       </w:pPr>
-      <w:bookmarkStart w:id="0" w:name="_GoBack"/>
-      <w:bookmarkEnd w:id="0"/>
     </w:p>
     <w:p>
       <w:pPr>
@@ -71,14 +69,152 @@
       <w:pPr>
         <w:pStyle w:val="3"/>
         <w:spacing w:before="160" w:after="80"/>
-      </w:pPr>
-      <w:r>
         <w:rPr>
           <w:b/>
           <w:color w:val="0F766E"/>
           <w:sz w:val="22"/>
         </w:rPr>
+      </w:pPr>
+      <w:r>
+        <w:rPr>
+          <w:b/>
+          <w:color w:val="0F766E"/>
+          <w:sz w:val="22"/>
+        </w:rPr>
         <w:t>1  —  Dependency Injection &amp; Lifetime</w:t>
+      </w:r>
+    </w:p>
+    <w:p>
+      <w:pPr>
+        <w:pStyle w:val="3"/>
+        <w:numPr>
+          <w:ilvl w:val="0"/>
+          <w:numId w:val="0"/>
+        </w:numPr>
+        <w:spacing w:before="160" w:after="80"/>
+        <w:ind w:leftChars="0"/>
+      </w:pPr>
+      <w:r>
+        <w:rPr>
+          <w:b/>
+          <w:sz w:val="18"/>
+        </w:rPr>
+        <w:t>Static, manually-constructed service + DbContext</w:t>
+      </w:r>
+      <w:r>
+        <w:rPr>
+          <w:sz w:val="18"/>
+        </w:rPr>
+        <w:t xml:space="preserve">  Controller uses a </w:t>
+      </w:r>
+    </w:p>
+    <w:p>
+      <w:pPr>
+        <w:spacing w:after="40"/>
+        <w:ind w:left="648"/>
+      </w:pPr>
+      <w:r>
+        <w:rPr>
+          <w:rFonts w:ascii="Consolas" w:hAnsi="Consolas"/>
+          <w:color w:val="7C2D12"/>
+          <w:sz w:val="15"/>
+        </w:rPr>
+        <w:t>private static OrderService _service = new OrderService(new AppDbContext());</w:t>
+      </w:r>
+    </w:p>
+    <w:p>
+      <w:pPr>
+        <w:pStyle w:val="23"/>
+        <w:spacing w:after="40"/>
+        <w:ind w:left="576"/>
+      </w:pPr>
+      <w:r>
+        <w:rPr>
+          <w:sz w:val="18"/>
+        </w:rPr>
+        <w:t>Bypasses ASP.NET Core DI entirely. The container cannot manage lifetime, disposal, or configuration (connection string, options). Testing requires real DB; no mocking. Fix: constructor-inject IOrderService and register it + AppDbContext with AddDbContext/AddScoped.</w:t>
+      </w:r>
+    </w:p>
+    <w:p>
+      <w:pPr>
+        <w:pStyle w:val="23"/>
+        <w:spacing w:after="40"/>
+        <w:ind w:left="576"/>
+      </w:pPr>
+      <w:r>
+        <w:rPr>
+          <w:sz w:val="18"/>
+        </w:rPr>
+        <w:t>DbContext is not thread-safe and is designed as scoped (one per request). Parking it in a static field makes it a de-facto singleton shared across all requests → race conditions, cached tracking state leaks between users, and eventual ObjectDisposedException / concurrency exceptions.</w:t>
+      </w:r>
+    </w:p>
+    <w:p>
+      <w:pPr>
+        <w:pStyle w:val="23"/>
+        <w:spacing w:after="40"/>
+        <w:ind w:left="576"/>
+      </w:pPr>
+      <w:r>
+        <w:rPr>
+          <w:rFonts w:hint="default"/>
+          <w:sz w:val="18"/>
+          <w:lang w:val="en-US"/>
+        </w:rPr>
+        <w:t>I</w:t>
+      </w:r>
+      <w:r>
+        <w:rPr>
+          <w:sz w:val="18"/>
+        </w:rPr>
+        <w:t>f AppDbContext holds a real SQL connection / pool, the app leaks connections and ignores pooling, logging, and retry policies configured in Program.cs.</w:t>
+      </w:r>
+    </w:p>
+    <w:p>
+      <w:pPr>
+        <w:pStyle w:val="23"/>
+        <w:spacing w:after="40"/>
+        <w:ind w:left="576"/>
+      </w:pPr>
+      <w:r>
+        <w:rPr>
+          <w:b/>
+          <w:sz w:val="18"/>
+        </w:rPr>
+        <w:t>OrderService</w:t>
+      </w:r>
+      <w:r>
+        <w:rPr>
+          <w:sz w:val="18"/>
+        </w:rPr>
+        <w:t xml:space="preserve">  Controller depends on the concrete </w:t>
+      </w:r>
+      <w:r>
+        <w:rPr>
+          <w:rFonts w:hint="default"/>
+          <w:sz w:val="18"/>
+          <w:lang w:val="en-US"/>
+        </w:rPr>
+        <w:t xml:space="preserve"> instead </w:t>
+      </w:r>
+      <w:r>
+        <w:rPr>
+          <w:sz w:val="18"/>
+        </w:rPr>
+        <w:t>Should depend on IOrderService (abstraction) so the controller stays thin and testable. Prevents swapping in a mock/fake without changing production code.</w:t>
+      </w:r>
+    </w:p>
+    <w:p>
+      <w:pPr>
+        <w:pStyle w:val="3"/>
+        <w:spacing w:before="160" w:after="80"/>
+      </w:pPr>
+      <w:r>
+        <w:rPr>
+          <w:b/>
+          <w:color w:val="0F766E"/>
+          <w:sz w:val="22"/>
+        </w:rPr>
+        <w:t>2  —  Async / Sync Mismatch &amp; Blocking</w:t>
       </w:r>
     </w:p>
     <w:p>
@@ -92,27 +228,162 @@
           <w:b/>
           <w:sz w:val="18"/>
         </w:rPr>
-        <w:t>Static, manually-constructed service + DbContext</w:t>
+        <w:t>async</w:t>
       </w:r>
       <w:r>
         <w:rPr>
           <w:sz w:val="18"/>
         </w:rPr>
-        <w:t xml:space="preserve">  Controller uses a </w:t>
+        <w:t xml:space="preserve">  All three service methods are marked but never await anything. GetOrderAsync calls _context.Orders.Include(...).FirstOrDefault(...) (sync), GetTotalRevenueAsync calls ToList() (sync), CreateOrderAsync calls SaveChanges() (sync). The compiler emits CS1998; at runtime the methods run synchronously while still allocating a state machine. Fix: use FirstOrDefaultAsync, ToListAsync, SaveChangesAsync and await them.</w:t>
       </w:r>
     </w:p>
     <w:p>
       <w:pPr>
+        <w:pStyle w:val="23"/>
         <w:spacing w:after="40"/>
-        <w:ind w:left="648"/>
-      </w:pPr>
-      <w:r>
-        <w:rPr>
-          <w:rFonts w:ascii="Consolas" w:hAnsi="Consolas"/>
-          <w:color w:val="7C2D12"/>
-          <w:sz w:val="15"/>
-        </w:rPr>
-        <w:t>private static OrderService _service = new OrderService(new AppDbContext());</w:t>
+        <w:ind w:left="288"/>
+      </w:pPr>
+      <w:r>
+        <w:rPr>
+          <w:b/>
+          <w:sz w:val="18"/>
+        </w:rPr>
+        <w:t>var order = _service.GetOrderAsync(id).Result</w:t>
+      </w:r>
+      <w:r>
+        <w:rPr>
+          <w:sz w:val="18"/>
+        </w:rPr>
+        <w:t xml:space="preserve">  GetOrder does Synchronously blocks the request thread waiting for the task. Under ASP.NET (classic) this deadlocks; on ASP.NET Core it starves the thread pool and kills scalability. Fix: make the action async and await: var order = await _service.GetOrderAsync(id);</w:t>
+      </w:r>
+    </w:p>
+    <w:p>
+      <w:pPr>
+        <w:pStyle w:val="23"/>
+        <w:spacing w:after="40"/>
+        <w:ind w:left="288"/>
+      </w:pPr>
+      <w:r>
+        <w:rPr>
+          <w:sz w:val="18"/>
+        </w:rPr>
+        <w:t>The controller’s GetOrder action itself is synchronous (IActionResult GetOrder) while calling an async service. The whole call chain should be async end-to-end with CancellationToken propagation.</w:t>
+      </w:r>
+    </w:p>
+    <w:p>
+      <w:pPr>
+        <w:pStyle w:val="3"/>
+        <w:spacing w:before="160" w:after="80"/>
+        <w:rPr>
+          <w:b/>
+          <w:color w:val="0F766E"/>
+          <w:sz w:val="22"/>
+        </w:rPr>
+      </w:pPr>
+    </w:p>
+    <w:p>
+      <w:pPr>
+        <w:pStyle w:val="3"/>
+        <w:spacing w:before="160" w:after="80"/>
+      </w:pPr>
+      <w:r>
+        <w:rPr>
+          <w:b/>
+          <w:color w:val="0F766E"/>
+          <w:sz w:val="22"/>
+        </w:rPr>
+        <w:t>3  —  Data Access &amp; Performance</w:t>
+      </w:r>
+    </w:p>
+    <w:p>
+      <w:pPr>
+        <w:pStyle w:val="23"/>
+        <w:bidi w:val="0"/>
+        <w:ind w:left="360" w:leftChars="0" w:hanging="360" w:firstLineChars="0"/>
+      </w:pPr>
+      <w:r>
+        <w:t>ToList()  GetTotalRevenueAsync loads every Order with then sums in memory with order.Items.Sum(...). This is N+1 / full table scan: with 100k orders you pull 100k rows + their Items into memory to compute one number. Fix: push the aggregation to the DB: await _context.Orders.SelectMany(o =&gt; o.Items).SumAsync(i =&gt; i.Price * i.Quantity).</w:t>
+      </w:r>
+    </w:p>
+    <w:p>
+      <w:pPr>
+        <w:pStyle w:val="23"/>
+        <w:bidi w:val="0"/>
+        <w:ind w:left="360" w:leftChars="0" w:hanging="360" w:firstLineChars="0"/>
+      </w:pPr>
+      <w:r>
+        <w:t>GetTotalRevenueAsync does not Include Items, so Items may be empty unless lazy-loading is on (it isn’t by default) → silently returns 0. Even with Include, the in-memory loop is still wrong.</w:t>
+      </w:r>
+    </w:p>
+    <w:p>
+      <w:pPr>
+        <w:pStyle w:val="23"/>
+        <w:bidi w:val="0"/>
+        <w:ind w:left="360" w:leftChars="0" w:hanging="360" w:firstLineChars="0"/>
+      </w:pPr>
+      <w:r>
+        <w:t>GetOrderAsync returns Task&lt;Order&gt; (non-nullable) but FirstOrDefault can return null. The signature should be Task&lt;Order?&gt; so callers are forced to handle the missing case and nullable warnings fire.</w:t>
+      </w:r>
+    </w:p>
+    <w:p>
+      <w:pPr>
+        <w:pStyle w:val="23"/>
+        <w:bidi w:val="0"/>
+        <w:ind w:left="360" w:leftChars="0" w:hanging="360" w:firstLineChars="0"/>
+      </w:pPr>
+      <w:r>
+        <w:rPr>
+          <w:b/>
+          <w:sz w:val="18"/>
+        </w:rPr>
+        <w:t>dto.Items[].Price</w:t>
+      </w:r>
+      <w:r>
+        <w:rPr>
+          <w:sz w:val="18"/>
+        </w:rPr>
+        <w:t xml:space="preserve">CreateOrderAsync trusts </w:t>
+      </w:r>
+      <w:r>
+        <w:rPr>
+          <w:rFonts w:hint="default"/>
+          <w:sz w:val="18"/>
+          <w:lang w:val="en-US"/>
+        </w:rPr>
+        <w:t xml:space="preserve"> </w:t>
+      </w:r>
+      <w:r>
+        <w:rPr>
+          <w:sz w:val="18"/>
+        </w:rPr>
+        <w:t>from the client. A caller can set Price=0 or negative and get free/cheap orders. Price should be resolved server-side from a Product/Catalog table and validated.</w:t>
+      </w:r>
+    </w:p>
+    <w:p>
+      <w:pPr>
+        <w:pStyle w:val="23"/>
+        <w:bidi w:val="0"/>
+        <w:ind w:left="360" w:leftChars="0" w:hanging="360" w:firstLineChars="0"/>
+      </w:pPr>
+      <w:r>
+        <w:rPr>
+          <w:sz w:val="18"/>
+        </w:rPr>
+        <w:t>No AsNoTracking for read paths (GetOrder / GetTotalRevenue). Tracking is wasted work and bloats the change tracker for read-only queries.</w:t>
+      </w:r>
+    </w:p>
+    <w:p>
+      <w:pPr>
+        <w:pStyle w:val="3"/>
+        <w:spacing w:before="160" w:after="80"/>
+      </w:pPr>
+      <w:r>
+        <w:rPr>
+          <w:b/>
+          <w:color w:val="0F766E"/>
+          <w:sz w:val="22"/>
+        </w:rPr>
+        <w:t>4  —  Validation &amp; Correctness</w:t>
       </w:r>
     </w:p>
     <w:p>
@@ -125,307 +396,14 @@
         <w:rPr>
           <w:sz w:val="18"/>
         </w:rPr>
-        <w:t>Bypasses ASP.NET Core DI entirely. The container cannot manage lifetime, disposal, or configuration (connection string, options). Testing requires real DB; no mocking. Fix: constructor-inject IOrderService and register it + AppDbContext with AddDbContext/AddScoped.</w:t>
+        <w:t>No null / empty guard on OrderDto or dto.Items. dto.Items.Select(...) throws NullReferenceException if the client sends { } or { items: null } → 500. Fix: guard + DataAnnotations ([Required], [MinLength(1)], [Range] on Quantity/Price).</w:t>
       </w:r>
     </w:p>
     <w:p>
       <w:pPr>
         <w:pStyle w:val="23"/>
-        <w:spacing w:after="40"/>
-        <w:ind w:left="576"/>
-      </w:pPr>
-      <w:r>
-        <w:rPr>
-          <w:sz w:val="18"/>
-        </w:rPr>
-        <w:t>DbContext is not thread-safe and is designed as scoped (one per request). Parking it in a static field makes it a de-facto singleton shared across all requests → race conditions, cached tracking state leaks between users, and eventual ObjectDisposedException / concurrency exceptions.</w:t>
-      </w:r>
-    </w:p>
-    <w:p>
-      <w:pPr>
-        <w:pStyle w:val="23"/>
-        <w:spacing w:after="40"/>
-        <w:ind w:left="576"/>
-      </w:pPr>
-      <w:r>
-        <w:rPr>
-          <w:sz w:val="18"/>
-        </w:rPr>
-        <w:t>If AppDbContext holds a real SQL connection / pool, the app leaks connections and ignores pooling, logging, and retry policies configured in Program.cs.</w:t>
-      </w:r>
-    </w:p>
-    <w:p>
-      <w:pPr>
-        <w:pStyle w:val="23"/>
-        <w:spacing w:after="40"/>
-        <w:ind w:left="288"/>
-      </w:pPr>
-      <w:r>
-        <w:rPr>
-          <w:b/>
-          <w:sz w:val="18"/>
-        </w:rPr>
-        <w:t>OrderService</w:t>
-      </w:r>
-      <w:r>
-        <w:rPr>
-          <w:sz w:val="18"/>
-        </w:rPr>
-        <w:t xml:space="preserve">  Controller depends on the concrete </w:t>
-      </w:r>
-    </w:p>
-    <w:p>
-      <w:pPr>
-        <w:pStyle w:val="23"/>
-        <w:spacing w:after="40"/>
-        <w:ind w:left="576"/>
-      </w:pPr>
-      <w:r>
-        <w:rPr>
-          <w:sz w:val="18"/>
-        </w:rPr>
-        <w:t>Should depend on IOrderService (abstraction) so the controller stays thin and testable. Prevents swapping in a mock/fake without changing production code.</w:t>
-      </w:r>
-    </w:p>
-    <w:p>
-      <w:pPr>
-        <w:pStyle w:val="3"/>
-        <w:spacing w:before="160" w:after="80"/>
-      </w:pPr>
-      <w:r>
-        <w:rPr>
-          <w:b/>
-          <w:color w:val="0F766E"/>
-          <w:sz w:val="22"/>
-        </w:rPr>
-        <w:t>2  —  Async / Sync Mismatch &amp; Blocking</w:t>
-      </w:r>
-    </w:p>
-    <w:p>
-      <w:pPr>
-        <w:pStyle w:val="23"/>
-        <w:spacing w:after="40"/>
-        <w:ind w:left="288"/>
-      </w:pPr>
-      <w:r>
-        <w:rPr>
-          <w:b/>
-          <w:sz w:val="18"/>
-        </w:rPr>
-        <w:t>async</w:t>
-      </w:r>
-      <w:r>
-        <w:rPr>
-          <w:sz w:val="18"/>
-        </w:rPr>
-        <w:t xml:space="preserve">  All three service methods are marked </w:t>
-      </w:r>
-    </w:p>
-    <w:p>
-      <w:pPr>
-        <w:pStyle w:val="23"/>
-        <w:spacing w:after="40"/>
-        <w:ind w:left="576"/>
-      </w:pPr>
-      <w:r>
-        <w:rPr>
-          <w:sz w:val="18"/>
-        </w:rPr>
-        <w:t>but never await anything. GetOrderAsync calls _context.Orders.Include(...).FirstOrDefault(...) (sync), GetTotalRevenueAsync calls ToList() (sync), CreateOrderAsync calls SaveChanges() (sync). The compiler emits CS1998; at runtime the methods run synchronously while still allocating a state machine. Fix: use FirstOrDefaultAsync, ToListAsync, SaveChangesAsync and await them.</w:t>
-      </w:r>
-    </w:p>
-    <w:p>
-      <w:pPr>
-        <w:pStyle w:val="23"/>
-        <w:spacing w:after="40"/>
-        <w:ind w:left="288"/>
-      </w:pPr>
-      <w:r>
-        <w:rPr>
-          <w:b/>
-          <w:sz w:val="18"/>
-        </w:rPr>
-        <w:t>var order = _service.GetOrderAsync(id).Result</w:t>
-      </w:r>
-      <w:r>
-        <w:rPr>
-          <w:sz w:val="18"/>
-        </w:rPr>
-        <w:t xml:space="preserve">  GetOrder does </w:t>
-      </w:r>
-    </w:p>
-    <w:p>
-      <w:pPr>
-        <w:pStyle w:val="23"/>
-        <w:spacing w:after="40"/>
-        <w:ind w:left="576"/>
-      </w:pPr>
-      <w:r>
-        <w:rPr>
-          <w:sz w:val="18"/>
-        </w:rPr>
-        <w:t>Synchronously blocks the request thread waiting for the task. Under ASP.NET (classic) this deadlocks; on ASP.NET Core it starves the thread pool and kills scalability. Fix: make the action async and await: var order = await _service.GetOrderAsync(id);</w:t>
-      </w:r>
-    </w:p>
-    <w:p>
-      <w:pPr>
-        <w:pStyle w:val="23"/>
-        <w:spacing w:after="40"/>
-        <w:ind w:left="576"/>
-      </w:pPr>
-      <w:r>
-        <w:rPr>
-          <w:sz w:val="18"/>
-        </w:rPr>
-        <w:t>The controller’s GetOrder action itself is synchronous (IActionResult GetOrder) while calling an async service. The whole call chain should be async end-to-end with CancellationToken propagation.</w:t>
-      </w:r>
-    </w:p>
-    <w:p>
-      <w:pPr>
-        <w:pStyle w:val="3"/>
-        <w:spacing w:before="160" w:after="80"/>
-        <w:rPr>
-          <w:b/>
-          <w:color w:val="0F766E"/>
-          <w:sz w:val="22"/>
-        </w:rPr>
-      </w:pPr>
-    </w:p>
-    <w:p>
-      <w:pPr>
-        <w:pStyle w:val="3"/>
-        <w:spacing w:before="160" w:after="80"/>
-      </w:pPr>
-      <w:r>
-        <w:rPr>
-          <w:b/>
-          <w:color w:val="0F766E"/>
-          <w:sz w:val="22"/>
-        </w:rPr>
-        <w:t>3  —  Data Access &amp; Performance</w:t>
-      </w:r>
-    </w:p>
-    <w:p>
-      <w:pPr>
-        <w:pStyle w:val="23"/>
-        <w:bidi w:val="0"/>
-        <w:ind w:left="360" w:leftChars="0" w:hanging="360" w:firstLineChars="0"/>
-      </w:pPr>
-      <w:r>
-        <w:t>ToList()  GetTotalRevenueAsync loads every Order with then sums in memory with order.Items.Sum(...). This is N+1 / full table scan: with 100k orders you pull 100k rows + their Items into memory to compute one number. Fix: push the aggregation to the DB: await _context.Orders.SelectMany(o =&gt; o.Items).SumAsync(i =&gt; i.Price * i.Quantity).</w:t>
-      </w:r>
-    </w:p>
-    <w:p>
-      <w:pPr>
-        <w:pStyle w:val="23"/>
-        <w:bidi w:val="0"/>
-        <w:ind w:left="360" w:leftChars="0" w:hanging="360" w:firstLineChars="0"/>
-      </w:pPr>
-      <w:r>
-        <w:t>GetTotalRevenueAsync does not Include Items, so Items may be empty unless lazy-loading is on (it isn’t by default) → silently returns 0. Even with Include, the in-memory loop is still wrong.</w:t>
-      </w:r>
-    </w:p>
-    <w:p>
-      <w:pPr>
-        <w:pStyle w:val="23"/>
-        <w:bidi w:val="0"/>
-        <w:ind w:left="360" w:leftChars="0" w:hanging="360" w:firstLineChars="0"/>
-      </w:pPr>
-      <w:r>
-        <w:t>GetOrderAsync returns Task&lt;Order&gt; (non-nullable) but FirstOrDefault can return null. The signature should be Task&lt;Order?&gt; so callers are forced to handle the missing case and nullable warnings fire.</w:t>
-      </w:r>
-    </w:p>
-    <w:p>
-      <w:pPr>
-        <w:pStyle w:val="23"/>
         <w:numPr>
-          <w:numId w:val="0"/>
-        </w:numPr>
-        <w:bidi w:val="0"/>
-        <w:ind w:leftChars="0"/>
-      </w:pPr>
-    </w:p>
-    <w:p>
-      <w:pPr>
-        <w:pStyle w:val="23"/>
-        <w:numPr>
-          <w:numId w:val="0"/>
-        </w:numPr>
-        <w:spacing w:after="40"/>
-        <w:ind w:left="-72" w:leftChars="0" w:firstLine="180" w:firstLineChars="100"/>
-      </w:pPr>
-      <w:r>
-        <w:rPr>
-          <w:b/>
-          <w:sz w:val="18"/>
-        </w:rPr>
-        <w:t>dto.Items[].Price</w:t>
-      </w:r>
-      <w:r>
-        <w:rPr>
-          <w:sz w:val="18"/>
-        </w:rPr>
-        <w:t xml:space="preserve">CreateOrderAsync trusts </w:t>
-      </w:r>
-      <w:r>
-        <w:rPr>
-          <w:rFonts w:hint="default"/>
-          <w:sz w:val="18"/>
-          <w:lang w:val="en-US"/>
-        </w:rPr>
-        <w:t xml:space="preserve"> </w:t>
-      </w:r>
-      <w:r>
-        <w:rPr>
-          <w:sz w:val="18"/>
-        </w:rPr>
-        <w:t>from the client. A caller can set Price=0 or negative and get free/cheap orders. Price should be resolved server-side from a Product/Catalog table and validated.</w:t>
-      </w:r>
-    </w:p>
-    <w:p>
-      <w:pPr>
-        <w:pStyle w:val="23"/>
-        <w:spacing w:after="40"/>
-        <w:ind w:left="576"/>
-      </w:pPr>
-      <w:r>
-        <w:rPr>
-          <w:sz w:val="18"/>
-        </w:rPr>
-        <w:t>No AsNoTracking for read paths (GetOrder / GetTotalRevenue). Tracking is wasted work and bloats the change tracker for read-only queries.</w:t>
-      </w:r>
-    </w:p>
-    <w:p>
-      <w:pPr>
-        <w:pStyle w:val="3"/>
-        <w:spacing w:before="160" w:after="80"/>
-      </w:pPr>
-      <w:r>
-        <w:rPr>
-          <w:b/>
-          <w:color w:val="0F766E"/>
-          <w:sz w:val="22"/>
-        </w:rPr>
-        <w:t>4  —  Validation &amp; Correctness</w:t>
-      </w:r>
-    </w:p>
-    <w:p>
-      <w:pPr>
-        <w:pStyle w:val="23"/>
-        <w:spacing w:after="40"/>
-        <w:ind w:left="576"/>
-      </w:pPr>
-      <w:r>
-        <w:rPr>
-          <w:sz w:val="18"/>
-        </w:rPr>
-        <w:t>No null / empty guard on OrderDto or dto.Items. dto.Items.Select(...) throws NullReferenceException if the client sends { } or { items: null } → 500. Fix: guard + DataAnnotations ([Required], [MinLength(1)], [Range] on Quantity/Price).</w:t>
-      </w:r>
-    </w:p>
-    <w:p>
-      <w:pPr>
-        <w:pStyle w:val="23"/>
-        <w:numPr>
+          <w:ilvl w:val="0"/>
           <w:numId w:val="0"/>
         </w:numPr>
         <w:spacing w:after="40"/>
@@ -449,6 +427,7 @@
       <w:pPr>
         <w:pStyle w:val="23"/>
         <w:numPr>
+          <w:ilvl w:val="0"/>
           <w:numId w:val="0"/>
         </w:numPr>
         <w:spacing w:after="40"/>
@@ -472,6 +451,7 @@
       <w:pPr>
         <w:pStyle w:val="23"/>
         <w:numPr>
+          <w:ilvl w:val="0"/>
           <w:numId w:val="0"/>
         </w:numPr>
         <w:spacing w:after="40"/>
@@ -529,6 +509,7 @@
       <w:pPr>
         <w:pStyle w:val="23"/>
         <w:numPr>
+          <w:ilvl w:val="0"/>
           <w:numId w:val="0"/>
         </w:numPr>
         <w:spacing w:after="40"/>
@@ -559,6 +540,7 @@
       <w:pPr>
         <w:pStyle w:val="23"/>
         <w:numPr>
+          <w:ilvl w:val="0"/>
           <w:numId w:val="0"/>
         </w:numPr>
         <w:spacing w:after="40"/>
@@ -601,6 +583,7 @@
       <w:pPr>
         <w:pStyle w:val="23"/>
         <w:numPr>
+          <w:ilvl w:val="0"/>
           <w:numId w:val="0"/>
         </w:numPr>
         <w:spacing w:after="40"/>
@@ -662,8 +645,7 @@
     </w:p>
     <w:p>
       <w:pPr>
-        <w:pStyle w:val="2"/>
-        <w:spacing w:before="200" w:after="80"/>
+        <w:spacing w:after="120"/>
       </w:pPr>
       <w:r>
         <w:rPr>
@@ -672,43 +654,6 @@
           <w:sz w:val="32"/>
         </w:rPr>
         <w:t>Part 3 — LINQ Exercise</w:t>
-      </w:r>
-    </w:p>
-    <w:p>
-      <w:pPr>
-        <w:spacing w:after="40"/>
-      </w:pPr>
-      <w:r>
-        <w:rPr>
-          <w:b/>
-          <w:i w:val="0"/>
-          <w:color w:val="FFFFFF"/>
-          <w:sz w:val="14"/>
-        </w:rPr>
-        <w:t xml:space="preserve">TASK 3  </w:t>
-      </w:r>
-      <w:r>
-        <w:rPr>
-          <w:b w:val="0"/>
-          <w:i/>
-          <w:color w:val="64748B"/>
-          <w:sz w:val="16"/>
-        </w:rPr>
-        <w:t xml:space="preserve">  Pure LINQ over List&lt;Loan&gt;  ·  ~10–15 minutes</w:t>
-      </w:r>
-    </w:p>
-    <w:p>
-      <w:pPr>
-        <w:spacing w:after="120"/>
-      </w:pPr>
-      <w:r>
-        <w:rPr>
-          <w:b w:val="0"/>
-          <w:i/>
-          <w:color w:val="64748B"/>
-          <w:sz w:val="17"/>
-        </w:rPr>
-        <w:t>All three methods are pure LINQ over an in-memory List&lt;Loan&gt;.  No EF translation is needed.  Implementations live in Library.Api/Queries/LoanQueries.cs  and are covered by Library.Api.Tests/LoanQueriesTests.cs.</w:t>
       </w:r>
     </w:p>
     <w:p>
@@ -1278,8 +1223,7 @@
     </w:p>
     <w:p>
       <w:pPr>
-        <w:pStyle w:val="2"/>
-        <w:spacing w:before="200" w:after="80"/>
+        <w:spacing w:after="80"/>
       </w:pPr>
       <w:r>
         <w:rPr>
@@ -1292,29 +1236,6 @@
     </w:p>
     <w:p>
       <w:pPr>
-        <w:spacing w:after="80"/>
-      </w:pPr>
-      <w:r>
-        <w:rPr>
-          <w:b/>
-          <w:i w:val="0"/>
-          <w:color w:val="FFFFFF"/>
-          <w:sz w:val="14"/>
-        </w:rPr>
-        <w:t xml:space="preserve">TASK 4  </w:t>
-      </w:r>
-      <w:r>
-        <w:rPr>
-          <w:b w:val="0"/>
-          <w:i/>
-          <w:color w:val="64748B"/>
-          <w:sz w:val="16"/>
-        </w:rPr>
-        <w:t xml:space="preserve">  Five questions  ·  ~10 minutes  ·  a few sentences each</w:t>
-      </w:r>
-    </w:p>
-    <w:p>
-      <w:pPr>
         <w:keepNext/>
         <w:spacing w:after="40"/>
       </w:pPr>
@@ -1874,42 +1795,7 @@
     </w:p>
     <w:p>
       <w:pPr>
-        <w:spacing w:after="40"/>
-        <w:ind w:left="216"/>
-        <w:rPr>
-          <w:i/>
-          <w:color w:val="64748B"/>
-          <w:sz w:val="18"/>
-        </w:rPr>
-      </w:pPr>
-    </w:p>
-    <w:p>
-      <w:pPr>
-        <w:spacing w:after="40"/>
-        <w:ind w:left="216"/>
-        <w:rPr>
-          <w:i/>
-          <w:color w:val="64748B"/>
-          <w:sz w:val="18"/>
-        </w:rPr>
-      </w:pPr>
-    </w:p>
-    <w:p>
-      <w:pPr>
         <w:keepNext/>
-        <w:spacing w:after="40"/>
-      </w:pPr>
-      <w:r>
-        <w:rPr>
-          <w:b/>
-          <w:color w:val="FFFFFF"/>
-          <w:sz w:val="16"/>
-        </w:rPr>
-        <w:t xml:space="preserve">Q5  </w:t>
-      </w:r>
-    </w:p>
-    <w:p>
-      <w:pPr>
         <w:spacing w:after="40"/>
       </w:pPr>
       <w:r>
@@ -2426,6 +2312,8 @@
         </w:rPr>
         <w:t>.</w:t>
       </w:r>
+      <w:bookmarkStart w:id="0" w:name="_GoBack"/>
+      <w:bookmarkEnd w:id="0"/>
     </w:p>
     <w:sectPr>
       <w:pgSz w:w="12240" w:h="15840"/>
@@ -2685,7 +2573,7 @@
     <w:lsdException w:uiPriority="99" w:name="table of authorities"/>
     <w:lsdException w:uiPriority="99" w:semiHidden="0" w:name="macro"/>
     <w:lsdException w:uiPriority="99" w:name="toa heading"/>
-    <w:lsdException w:uiPriority="99" w:semiHidden="0" w:name="List"/>
+    <w:lsdException w:qFormat="1" w:uiPriority="99" w:semiHidden="0" w:name="List"/>
     <w:lsdException w:uiPriority="99" w:semiHidden="0" w:name="List Bullet"/>
     <w:lsdException w:uiPriority="99" w:semiHidden="0" w:name="List Number"/>
     <w:lsdException w:uiPriority="99" w:semiHidden="0" w:name="List 2"/>
@@ -2703,8 +2591,8 @@
     <w:lsdException w:qFormat="1" w:unhideWhenUsed="0" w:uiPriority="10" w:semiHidden="0" w:name="Title"/>
     <w:lsdException w:uiPriority="99" w:name="Closing"/>
     <w:lsdException w:uiPriority="99" w:name="Signature"/>
-    <w:lsdException w:uiPriority="1" w:name="Default Paragraph Font"/>
-    <w:lsdException w:uiPriority="99" w:semiHidden="0" w:name="Body Text"/>
+    <w:lsdException w:qFormat="1" w:uiPriority="1" w:name="Default Paragraph Font"/>
+    <w:lsdException w:qFormat="1" w:uiPriority="99" w:semiHidden="0" w:name="Body Text"/>
     <w:lsdException w:uiPriority="99" w:name="Body Text Indent"/>
     <w:lsdException w:uiPriority="99" w:semiHidden="0" w:name="List Continue"/>
     <w:lsdException w:uiPriority="99" w:semiHidden="0" w:name="List Continue 2"/>
@@ -2718,8 +2606,8 @@
     <w:lsdException w:uiPriority="99" w:name="Body Text First Indent"/>
     <w:lsdException w:uiPriority="99" w:name="Body Text First Indent 2"/>
     <w:lsdException w:uiPriority="99" w:name="Note Heading"/>
-    <w:lsdException w:uiPriority="99" w:semiHidden="0" w:name="Body Text 2"/>
-    <w:lsdException w:uiPriority="99" w:semiHidden="0" w:name="Body Text 3"/>
+    <w:lsdException w:qFormat="1" w:uiPriority="99" w:semiHidden="0" w:name="Body Text 2"/>
+    <w:lsdException w:qFormat="1" w:uiPriority="99" w:semiHidden="0" w:name="Body Text 3"/>
     <w:lsdException w:uiPriority="99" w:name="Body Text Indent 2"/>
     <w:lsdException w:uiPriority="99" w:name="Body Text Indent 3"/>
     <w:lsdException w:uiPriority="99" w:name="Block Text"/>
@@ -2741,7 +2629,7 @@
     <w:lsdException w:uiPriority="99" w:name="HTML Sample"/>
     <w:lsdException w:uiPriority="99" w:name="HTML Typewriter"/>
     <w:lsdException w:uiPriority="99" w:name="HTML Variable"/>
-    <w:lsdException w:uiPriority="99" w:name="Normal Table"/>
+    <w:lsdException w:qFormat="1" w:uiPriority="99" w:name="Normal Table"/>
     <w:lsdException w:uiPriority="99" w:name="annotation subject"/>
     <w:lsdException w:uiPriority="99" w:name="Table Simple 1"/>
     <w:lsdException w:uiPriority="99" w:name="Table Simple 2"/>
@@ -2791,15 +2679,15 @@
     <w:lsdException w:qFormat="1" w:unhideWhenUsed="0" w:uiPriority="1" w:semiHidden="0" w:name="No Spacing"/>
     <w:lsdException w:unhideWhenUsed="0" w:uiPriority="60" w:semiHidden="0" w:name="Light Shading"/>
     <w:lsdException w:unhideWhenUsed="0" w:uiPriority="61" w:semiHidden="0" w:name="Light List"/>
-    <w:lsdException w:unhideWhenUsed="0" w:uiPriority="62" w:semiHidden="0" w:name="Light Grid"/>
-    <w:lsdException w:unhideWhenUsed="0" w:uiPriority="63" w:semiHidden="0" w:name="Medium Shading 1"/>
+    <w:lsdException w:qFormat="1" w:unhideWhenUsed="0" w:uiPriority="62" w:semiHidden="0" w:name="Light Grid"/>
+    <w:lsdException w:qFormat="1" w:unhideWhenUsed="0" w:uiPriority="63" w:semiHidden="0" w:name="Medium Shading 1"/>
     <w:lsdException w:unhideWhenUsed="0" w:uiPriority="64" w:semiHidden="0" w:name="Medium Shading 2"/>
     <w:lsdException w:unhideWhenUsed="0" w:uiPriority="65" w:semiHidden="0" w:name="Medium List 1"/>
     <w:lsdException w:unhideWhenUsed="0" w:uiPriority="66" w:semiHidden="0" w:name="Medium List 2"/>
     <w:lsdException w:unhideWhenUsed="0" w:uiPriority="67" w:semiHidden="0" w:name="Medium Grid 1"/>
     <w:lsdException w:unhideWhenUsed="0" w:uiPriority="68" w:semiHidden="0" w:name="Medium Grid 2"/>
-    <w:lsdException w:unhideWhenUsed="0" w:uiPriority="69" w:semiHidden="0" w:name="Medium Grid 3"/>
-    <w:lsdException w:unhideWhenUsed="0" w:uiPriority="70" w:semiHidden="0" w:name="Dark List"/>
+    <w:lsdException w:qFormat="1" w:unhideWhenUsed="0" w:uiPriority="69" w:semiHidden="0" w:name="Medium Grid 3"/>
+    <w:lsdException w:qFormat="1" w:unhideWhenUsed="0" w:uiPriority="70" w:semiHidden="0" w:name="Dark List"/>
     <w:lsdException w:unhideWhenUsed="0" w:uiPriority="71" w:semiHidden="0" w:name="Colorful Shading"/>
     <w:lsdException w:unhideWhenUsed="0" w:uiPriority="72" w:semiHidden="0" w:name="Colorful List"/>
     <w:lsdException w:unhideWhenUsed="0" w:uiPriority="73" w:semiHidden="0" w:name="Colorful Grid"/>
@@ -2807,7 +2695,7 @@
     <w:lsdException w:unhideWhenUsed="0" w:uiPriority="61" w:semiHidden="0" w:name="Light List Accent 1"/>
     <w:lsdException w:unhideWhenUsed="0" w:uiPriority="62" w:semiHidden="0" w:name="Light Grid Accent 1"/>
     <w:lsdException w:unhideWhenUsed="0" w:uiPriority="63" w:semiHidden="0" w:name="Medium Shading 1 Accent 1"/>
-    <w:lsdException w:unhideWhenUsed="0" w:uiPriority="64" w:semiHidden="0" w:name="Medium Shading 2 Accent 1"/>
+    <w:lsdException w:qFormat="1" w:unhideWhenUsed="0" w:uiPriority="64" w:semiHidden="0" w:name="Medium Shading 2 Accent 1"/>
     <w:lsdException w:unhideWhenUsed="0" w:uiPriority="65" w:semiHidden="0" w:name="Medium List 1 Accent 1"/>
     <w:lsdException w:qFormat="1" w:unhideWhenUsed="0" w:uiPriority="34" w:semiHidden="0" w:name="List Paragraph"/>
     <w:lsdException w:qFormat="1" w:unhideWhenUsed="0" w:uiPriority="29" w:semiHidden="0" w:name="Quote"/>
@@ -2815,24 +2703,24 @@
     <w:lsdException w:unhideWhenUsed="0" w:uiPriority="66" w:semiHidden="0" w:name="Medium List 2 Accent 1"/>
     <w:lsdException w:unhideWhenUsed="0" w:uiPriority="67" w:semiHidden="0" w:name="Medium Grid 1 Accent 1"/>
     <w:lsdException w:unhideWhenUsed="0" w:uiPriority="68" w:semiHidden="0" w:name="Medium Grid 2 Accent 1"/>
-    <w:lsdException w:unhideWhenUsed="0" w:uiPriority="69" w:semiHidden="0" w:name="Medium Grid 3 Accent 1"/>
-    <w:lsdException w:unhideWhenUsed="0" w:uiPriority="70" w:semiHidden="0" w:name="Dark List Accent 1"/>
+    <w:lsdException w:qFormat="1" w:unhideWhenUsed="0" w:uiPriority="69" w:semiHidden="0" w:name="Medium Grid 3 Accent 1"/>
+    <w:lsdException w:qFormat="1" w:unhideWhenUsed="0" w:uiPriority="70" w:semiHidden="0" w:name="Dark List Accent 1"/>
     <w:lsdException w:unhideWhenUsed="0" w:uiPriority="71" w:semiHidden="0" w:name="Colorful Shading Accent 1"/>
     <w:lsdException w:unhideWhenUsed="0" w:uiPriority="72" w:semiHidden="0" w:name="Colorful List Accent 1"/>
     <w:lsdException w:unhideWhenUsed="0" w:uiPriority="73" w:semiHidden="0" w:name="Colorful Grid Accent 1"/>
     <w:lsdException w:unhideWhenUsed="0" w:uiPriority="60" w:semiHidden="0" w:name="Light Shading Accent 2"/>
     <w:lsdException w:unhideWhenUsed="0" w:uiPriority="61" w:semiHidden="0" w:name="Light List Accent 2"/>
-    <w:lsdException w:unhideWhenUsed="0" w:uiPriority="62" w:semiHidden="0" w:name="Light Grid Accent 2"/>
-    <w:lsdException w:unhideWhenUsed="0" w:uiPriority="63" w:semiHidden="0" w:name="Medium Shading 1 Accent 2"/>
+    <w:lsdException w:qFormat="1" w:unhideWhenUsed="0" w:uiPriority="62" w:semiHidden="0" w:name="Light Grid Accent 2"/>
+    <w:lsdException w:qFormat="1" w:unhideWhenUsed="0" w:uiPriority="63" w:semiHidden="0" w:name="Medium Shading 1 Accent 2"/>
     <w:lsdException w:unhideWhenUsed="0" w:uiPriority="64" w:semiHidden="0" w:name="Medium Shading 2 Accent 2"/>
     <w:lsdException w:unhideWhenUsed="0" w:uiPriority="65" w:semiHidden="0" w:name="Medium List 1 Accent 2"/>
     <w:lsdException w:unhideWhenUsed="0" w:uiPriority="66" w:semiHidden="0" w:name="Medium List 2 Accent 2"/>
     <w:lsdException w:unhideWhenUsed="0" w:uiPriority="67" w:semiHidden="0" w:name="Medium Grid 1 Accent 2"/>
     <w:lsdException w:unhideWhenUsed="0" w:uiPriority="68" w:semiHidden="0" w:name="Medium Grid 2 Accent 2"/>
-    <w:lsdException w:unhideWhenUsed="0" w:uiPriority="69" w:semiHidden="0" w:name="Medium Grid 3 Accent 2"/>
-    <w:lsdException w:unhideWhenUsed="0" w:uiPriority="70" w:semiHidden="0" w:name="Dark List Accent 2"/>
-    <w:lsdException w:unhideWhenUsed="0" w:uiPriority="71" w:semiHidden="0" w:name="Colorful Shading Accent 2"/>
-    <w:lsdException w:unhideWhenUsed="0" w:uiPriority="72" w:semiHidden="0" w:name="Colorful List Accent 2"/>
+    <w:lsdException w:qFormat="1" w:unhideWhenUsed="0" w:uiPriority="69" w:semiHidden="0" w:name="Medium Grid 3 Accent 2"/>
+    <w:lsdException w:qFormat="1" w:unhideWhenUsed="0" w:uiPriority="70" w:semiHidden="0" w:name="Dark List Accent 2"/>
+    <w:lsdException w:qFormat="1" w:unhideWhenUsed="0" w:uiPriority="71" w:semiHidden="0" w:name="Colorful Shading Accent 2"/>
+    <w:lsdException w:qFormat="1" w:unhideWhenUsed="0" w:uiPriority="72" w:semiHidden="0" w:name="Colorful List Accent 2"/>
     <w:lsdException w:unhideWhenUsed="0" w:uiPriority="73" w:semiHidden="0" w:name="Colorful Grid Accent 2"/>
     <w:lsdException w:unhideWhenUsed="0" w:uiPriority="60" w:semiHidden="0" w:name="Light Shading Accent 3"/>
     <w:lsdException w:unhideWhenUsed="0" w:uiPriority="61" w:semiHidden="0" w:name="Light List Accent 3"/>
@@ -2843,28 +2731,28 @@
     <w:lsdException w:unhideWhenUsed="0" w:uiPriority="66" w:semiHidden="0" w:name="Medium List 2 Accent 3"/>
     <w:lsdException w:unhideWhenUsed="0" w:uiPriority="67" w:semiHidden="0" w:name="Medium Grid 1 Accent 3"/>
     <w:lsdException w:unhideWhenUsed="0" w:uiPriority="68" w:semiHidden="0" w:name="Medium Grid 2 Accent 3"/>
-    <w:lsdException w:unhideWhenUsed="0" w:uiPriority="69" w:semiHidden="0" w:name="Medium Grid 3 Accent 3"/>
+    <w:lsdException w:qFormat="1" w:unhideWhenUsed="0" w:uiPriority="69" w:semiHidden="0" w:name="Medium Grid 3 Accent 3"/>
     <w:lsdException w:unhideWhenUsed="0" w:uiPriority="70" w:semiHidden="0" w:name="Dark List Accent 3"/>
     <w:lsdException w:unhideWhenUsed="0" w:uiPriority="71" w:semiHidden="0" w:name="Colorful Shading Accent 3"/>
-    <w:lsdException w:unhideWhenUsed="0" w:uiPriority="72" w:semiHidden="0" w:name="Colorful List Accent 3"/>
-    <w:lsdException w:unhideWhenUsed="0" w:uiPriority="73" w:semiHidden="0" w:name="Colorful Grid Accent 3"/>
+    <w:lsdException w:qFormat="1" w:unhideWhenUsed="0" w:uiPriority="72" w:semiHidden="0" w:name="Colorful List Accent 3"/>
+    <w:lsdException w:qFormat="1" w:unhideWhenUsed="0" w:uiPriority="73" w:semiHidden="0" w:name="Colorful Grid Accent 3"/>
     <w:lsdException w:unhideWhenUsed="0" w:uiPriority="60" w:semiHidden="0" w:name="Light Shading Accent 4"/>
-    <w:lsdException w:unhideWhenUsed="0" w:uiPriority="61" w:semiHidden="0" w:name="Light List Accent 4"/>
-    <w:lsdException w:unhideWhenUsed="0" w:uiPriority="62" w:semiHidden="0" w:name="Light Grid Accent 4"/>
-    <w:lsdException w:unhideWhenUsed="0" w:uiPriority="63" w:semiHidden="0" w:name="Medium Shading 1 Accent 4"/>
+    <w:lsdException w:qFormat="1" w:unhideWhenUsed="0" w:uiPriority="61" w:semiHidden="0" w:name="Light List Accent 4"/>
+    <w:lsdException w:qFormat="1" w:unhideWhenUsed="0" w:uiPriority="62" w:semiHidden="0" w:name="Light Grid Accent 4"/>
+    <w:lsdException w:qFormat="1" w:unhideWhenUsed="0" w:uiPriority="63" w:semiHidden="0" w:name="Medium Shading 1 Accent 4"/>
     <w:lsdException w:unhideWhenUsed="0" w:uiPriority="64" w:semiHidden="0" w:name="Medium Shading 2 Accent 4"/>
     <w:lsdException w:unhideWhenUsed="0" w:uiPriority="65" w:semiHidden="0" w:name="Medium List 1 Accent 4"/>
     <w:lsdException w:unhideWhenUsed="0" w:uiPriority="66" w:semiHidden="0" w:name="Medium List 2 Accent 4"/>
     <w:lsdException w:unhideWhenUsed="0" w:uiPriority="67" w:semiHidden="0" w:name="Medium Grid 1 Accent 4"/>
     <w:lsdException w:unhideWhenUsed="0" w:uiPriority="68" w:semiHidden="0" w:name="Medium Grid 2 Accent 4"/>
-    <w:lsdException w:unhideWhenUsed="0" w:uiPriority="69" w:semiHidden="0" w:name="Medium Grid 3 Accent 4"/>
+    <w:lsdException w:qFormat="1" w:unhideWhenUsed="0" w:uiPriority="69" w:semiHidden="0" w:name="Medium Grid 3 Accent 4"/>
     <w:lsdException w:unhideWhenUsed="0" w:uiPriority="70" w:semiHidden="0" w:name="Dark List Accent 4"/>
     <w:lsdException w:unhideWhenUsed="0" w:uiPriority="71" w:semiHidden="0" w:name="Colorful Shading Accent 4"/>
     <w:lsdException w:unhideWhenUsed="0" w:uiPriority="72" w:semiHidden="0" w:name="Colorful List Accent 4"/>
     <w:lsdException w:unhideWhenUsed="0" w:uiPriority="73" w:semiHidden="0" w:name="Colorful Grid Accent 4"/>
     <w:lsdException w:unhideWhenUsed="0" w:uiPriority="60" w:semiHidden="0" w:name="Light Shading Accent 5"/>
     <w:lsdException w:unhideWhenUsed="0" w:uiPriority="61" w:semiHidden="0" w:name="Light List Accent 5"/>
-    <w:lsdException w:unhideWhenUsed="0" w:uiPriority="62" w:semiHidden="0" w:name="Light Grid Accent 5"/>
+    <w:lsdException w:qFormat="1" w:unhideWhenUsed="0" w:uiPriority="62" w:semiHidden="0" w:name="Light Grid Accent 5"/>
     <w:lsdException w:unhideWhenUsed="0" w:uiPriority="63" w:semiHidden="0" w:name="Medium Shading 1 Accent 5"/>
     <w:lsdException w:unhideWhenUsed="0" w:uiPriority="64" w:semiHidden="0" w:name="Medium Shading 2 Accent 5"/>
     <w:lsdException w:unhideWhenUsed="0" w:uiPriority="65" w:semiHidden="0" w:name="Medium List 1 Accent 5"/>
@@ -2873,19 +2761,19 @@
     <w:lsdException w:unhideWhenUsed="0" w:uiPriority="68" w:semiHidden="0" w:name="Medium Grid 2 Accent 5"/>
     <w:lsdException w:unhideWhenUsed="0" w:uiPriority="69" w:semiHidden="0" w:name="Medium Grid 3 Accent 5"/>
     <w:lsdException w:unhideWhenUsed="0" w:uiPriority="70" w:semiHidden="0" w:name="Dark List Accent 5"/>
-    <w:lsdException w:unhideWhenUsed="0" w:uiPriority="71" w:semiHidden="0" w:name="Colorful Shading Accent 5"/>
+    <w:lsdException w:qFormat="1" w:unhideWhenUsed="0" w:uiPriority="71" w:semiHidden="0" w:name="Colorful Shading Accent 5"/>
     <w:lsdException w:unhideWhenUsed="0" w:uiPriority="72" w:semiHidden="0" w:name="Colorful List Accent 5"/>
     <w:lsdException w:unhideWhenUsed="0" w:uiPriority="73" w:semiHidden="0" w:name="Colorful Grid Accent 5"/>
     <w:lsdException w:unhideWhenUsed="0" w:uiPriority="60" w:semiHidden="0" w:name="Light Shading Accent 6"/>
     <w:lsdException w:unhideWhenUsed="0" w:uiPriority="61" w:semiHidden="0" w:name="Light List Accent 6"/>
     <w:lsdException w:unhideWhenUsed="0" w:uiPriority="62" w:semiHidden="0" w:name="Light Grid Accent 6"/>
     <w:lsdException w:unhideWhenUsed="0" w:uiPriority="63" w:semiHidden="0" w:name="Medium Shading 1 Accent 6"/>
-    <w:lsdException w:unhideWhenUsed="0" w:uiPriority="64" w:semiHidden="0" w:name="Medium Shading 2 Accent 6"/>
+    <w:lsdException w:qFormat="1" w:unhideWhenUsed="0" w:uiPriority="64" w:semiHidden="0" w:name="Medium Shading 2 Accent 6"/>
     <w:lsdException w:unhideWhenUsed="0" w:uiPriority="65" w:semiHidden="0" w:name="Medium List 1 Accent 6"/>
-    <w:lsdException w:unhideWhenUsed="0" w:uiPriority="66" w:semiHidden="0" w:name="Medium List 2 Accent 6"/>
+    <w:lsdException w:qFormat="1" w:unhideWhenUsed="0" w:uiPriority="66" w:semiHidden="0" w:name="Medium List 2 Accent 6"/>
     <w:lsdException w:unhideWhenUsed="0" w:uiPriority="67" w:semiHidden="0" w:name="Medium Grid 1 Accent 6"/>
     <w:lsdException w:unhideWhenUsed="0" w:uiPriority="68" w:semiHidden="0" w:name="Medium Grid 2 Accent 6"/>
-    <w:lsdException w:unhideWhenUsed="0" w:uiPriority="69" w:semiHidden="0" w:name="Medium Grid 3 Accent 6"/>
+    <w:lsdException w:qFormat="1" w:unhideWhenUsed="0" w:uiPriority="69" w:semiHidden="0" w:name="Medium Grid 3 Accent 6"/>
     <w:lsdException w:unhideWhenUsed="0" w:uiPriority="70" w:semiHidden="0" w:name="Dark List Accent 6"/>
     <w:lsdException w:unhideWhenUsed="0" w:uiPriority="71" w:semiHidden="0" w:name="Colorful Shading Accent 6"/>
     <w:lsdException w:unhideWhenUsed="0" w:uiPriority="72" w:semiHidden="0" w:name="Colorful List Accent 6"/>
@@ -3145,12 +3033,14 @@
     <w:name w:val="Default Paragraph Font"/>
     <w:semiHidden/>
     <w:unhideWhenUsed/>
+    <w:qFormat/>
     <w:uiPriority w:val="1"/>
   </w:style>
   <w:style w:type="table" w:default="1" w:styleId="12">
     <w:name w:val="Normal Table"/>
     <w:semiHidden/>
     <w:unhideWhenUsed/>
+    <w:qFormat/>
     <w:uiPriority w:val="99"/>
     <w:tblPr>
       <w:tblCellMar>
@@ -3166,6 +3056,7 @@
     <w:basedOn w:val="1"/>
     <w:link w:val="144"/>
     <w:unhideWhenUsed/>
+    <w:qFormat/>
     <w:uiPriority w:val="99"/>
     <w:pPr>
       <w:spacing w:after="120"/>
@@ -3176,6 +3067,7 @@
     <w:basedOn w:val="1"/>
     <w:link w:val="145"/>
     <w:unhideWhenUsed/>
+    <w:qFormat/>
     <w:uiPriority w:val="99"/>
     <w:pPr>
       <w:spacing w:after="120" w:line="480" w:lineRule="auto"/>
@@ -3186,6 +3078,7 @@
     <w:basedOn w:val="1"/>
     <w:link w:val="146"/>
     <w:unhideWhenUsed/>
+    <w:qFormat/>
     <w:uiPriority w:val="99"/>
     <w:pPr>
       <w:spacing w:after="120"/>
@@ -3263,6 +3156,7 @@
     <w:name w:val="List"/>
     <w:basedOn w:val="1"/>
     <w:unhideWhenUsed/>
+    <w:qFormat/>
     <w:uiPriority w:val="99"/>
     <w:pPr>
       <w:ind w:left="360" w:hanging="360"/>
@@ -4571,6 +4465,7 @@
   <w:style w:type="table" w:styleId="48">
     <w:name w:val="Light List Accent 4"/>
     <w:basedOn w:val="12"/>
+    <w:qFormat/>
     <w:uiPriority w:val="61"/>
     <w:pPr>
       <w:spacing w:after="0" w:line="240" w:lineRule="auto"/>
@@ -4850,6 +4745,7 @@
   <w:style w:type="table" w:styleId="51">
     <w:name w:val="Light Grid"/>
     <w:basedOn w:val="12"/>
+    <w:qFormat/>
     <w:uiPriority w:val="62"/>
     <w:pPr>
       <w:spacing w:after="0" w:line="240" w:lineRule="auto"/>
@@ -5102,6 +4998,7 @@
   <w:style w:type="table" w:styleId="53">
     <w:name w:val="Light Grid Accent 2"/>
     <w:basedOn w:val="12"/>
+    <w:qFormat/>
     <w:uiPriority w:val="62"/>
     <w:pPr>
       <w:spacing w:after="0" w:line="240" w:lineRule="auto"/>
@@ -5354,6 +5251,7 @@
   <w:style w:type="table" w:styleId="55">
     <w:name w:val="Light Grid Accent 4"/>
     <w:basedOn w:val="12"/>
+    <w:qFormat/>
     <w:uiPriority w:val="62"/>
     <w:pPr>
       <w:spacing w:after="0" w:line="240" w:lineRule="auto"/>
@@ -5480,6 +5378,7 @@
   <w:style w:type="table" w:styleId="56">
     <w:name w:val="Light Grid Accent 5"/>
     <w:basedOn w:val="12"/>
+    <w:qFormat/>
     <w:uiPriority w:val="62"/>
     <w:pPr>
       <w:spacing w:after="0" w:line="240" w:lineRule="auto"/>
@@ -5732,6 +5631,7 @@
   <w:style w:type="table" w:styleId="58">
     <w:name w:val="Medium Shading 1"/>
     <w:basedOn w:val="12"/>
+    <w:qFormat/>
     <w:uiPriority w:val="63"/>
     <w:pPr>
       <w:spacing w:after="0" w:line="240" w:lineRule="auto"/>
@@ -5946,6 +5846,7 @@
   <w:style w:type="table" w:styleId="60">
     <w:name w:val="Medium Shading 1 Accent 2"/>
     <w:basedOn w:val="12"/>
+    <w:qFormat/>
     <w:uiPriority w:val="63"/>
     <w:pPr>
       <w:spacing w:after="0" w:line="240" w:lineRule="auto"/>
@@ -6160,6 +6061,7 @@
   <w:style w:type="table" w:styleId="62">
     <w:name w:val="Medium Shading 1 Accent 4"/>
     <w:basedOn w:val="12"/>
+    <w:qFormat/>
     <w:uiPriority w:val="63"/>
     <w:pPr>
       <w:spacing w:after="0" w:line="240" w:lineRule="auto"/>
@@ -6646,6 +6548,7 @@
   <w:style w:type="table" w:styleId="66">
     <w:name w:val="Medium Shading 2 Accent 1"/>
     <w:basedOn w:val="12"/>
+    <w:qFormat/>
     <w:uiPriority w:val="64"/>
     <w:pPr>
       <w:spacing w:after="0" w:line="240" w:lineRule="auto"/>
@@ -7471,6 +7374,7 @@
   <w:style w:type="table" w:styleId="71">
     <w:name w:val="Medium Shading 2 Accent 6"/>
     <w:basedOn w:val="12"/>
+    <w:qFormat/>
     <w:uiPriority w:val="64"/>
     <w:pPr>
       <w:spacing w:after="0" w:line="240" w:lineRule="auto"/>
@@ -9040,6 +8944,7 @@
   <w:style w:type="table" w:styleId="85">
     <w:name w:val="Medium List 2 Accent 6"/>
     <w:basedOn w:val="12"/>
+    <w:qFormat/>
     <w:uiPriority w:val="66"/>
     <w:pPr>
       <w:spacing w:after="0" w:line="240" w:lineRule="auto"/>
@@ -10674,6 +10579,7 @@
   <w:style w:type="table" w:styleId="100">
     <w:name w:val="Medium Grid 3"/>
     <w:basedOn w:val="12"/>
+    <w:qFormat/>
     <w:uiPriority w:val="69"/>
     <w:pPr>
       <w:spacing w:after="0" w:line="240" w:lineRule="auto"/>
@@ -10831,6 +10737,7 @@
   <w:style w:type="table" w:styleId="101">
     <w:name w:val="Medium Grid 3 Accent 1"/>
     <w:basedOn w:val="12"/>
+    <w:qFormat/>
     <w:uiPriority w:val="69"/>
     <w:pPr>
       <w:spacing w:after="0" w:line="240" w:lineRule="auto"/>
@@ -10988,6 +10895,7 @@
   <w:style w:type="table" w:styleId="102">
     <w:name w:val="Medium Grid 3 Accent 2"/>
     <w:basedOn w:val="12"/>
+    <w:qFormat/>
     <w:uiPriority w:val="69"/>
     <w:pPr>
       <w:spacing w:after="0" w:line="240" w:lineRule="auto"/>
@@ -11145,6 +11053,7 @@
   <w:style w:type="table" w:styleId="103">
     <w:name w:val="Medium Grid 3 Accent 3"/>
     <w:basedOn w:val="12"/>
+    <w:qFormat/>
     <w:uiPriority w:val="69"/>
     <w:pPr>
       <w:spacing w:after="0" w:line="240" w:lineRule="auto"/>
@@ -11302,6 +11211,7 @@
   <w:style w:type="table" w:styleId="104">
     <w:name w:val="Medium Grid 3 Accent 4"/>
     <w:basedOn w:val="12"/>
+    <w:qFormat/>
     <w:uiPriority w:val="69"/>
     <w:pPr>
       <w:spacing w:after="0" w:line="240" w:lineRule="auto"/>
@@ -11616,6 +11526,7 @@
   <w:style w:type="table" w:styleId="106">
     <w:name w:val="Medium Grid 3 Accent 6"/>
     <w:basedOn w:val="12"/>
+    <w:qFormat/>
     <w:uiPriority w:val="69"/>
     <w:pPr>
       <w:spacing w:after="0" w:line="240" w:lineRule="auto"/>
@@ -11773,6 +11684,7 @@
   <w:style w:type="table" w:styleId="107">
     <w:name w:val="Dark List"/>
     <w:basedOn w:val="12"/>
+    <w:qFormat/>
     <w:uiPriority w:val="70"/>
     <w:pPr>
       <w:spacing w:after="0" w:line="240" w:lineRule="auto"/>
@@ -11888,6 +11800,7 @@
   <w:style w:type="table" w:styleId="108">
     <w:name w:val="Dark List Accent 1"/>
     <w:basedOn w:val="12"/>
+    <w:qFormat/>
     <w:uiPriority w:val="70"/>
     <w:pPr>
       <w:spacing w:after="0" w:line="240" w:lineRule="auto"/>
@@ -12003,6 +11916,7 @@
   <w:style w:type="table" w:styleId="109">
     <w:name w:val="Dark List Accent 2"/>
     <w:basedOn w:val="12"/>
+    <w:qFormat/>
     <w:uiPriority w:val="70"/>
     <w:pPr>
       <w:spacing w:after="0" w:line="240" w:lineRule="auto"/>
@@ -12874,6 +12788,7 @@
   <w:style w:type="table" w:styleId="116">
     <w:name w:val="Colorful Shading Accent 2"/>
     <w:basedOn w:val="12"/>
+    <w:qFormat/>
     <w:uiPriority w:val="71"/>
     <w:pPr>
       <w:spacing w:after="0" w:line="240" w:lineRule="auto"/>
@@ -13298,6 +13213,7 @@
   <w:style w:type="table" w:styleId="119">
     <w:name w:val="Colorful Shading Accent 5"/>
     <w:basedOn w:val="12"/>
+    <w:qFormat/>
     <w:uiPriority w:val="71"/>
     <w:pPr>
       <w:spacing w:after="0" w:line="240" w:lineRule="auto"/>
@@ -13778,6 +13694,7 @@
   <w:style w:type="table" w:styleId="123">
     <w:name w:val="Colorful List Accent 2"/>
     <w:basedOn w:val="12"/>
+    <w:qFormat/>
     <w:uiPriority w:val="72"/>
     <w:pPr>
       <w:spacing w:after="0" w:line="240" w:lineRule="auto"/>
@@ -13870,6 +13787,7 @@
   <w:style w:type="table" w:styleId="124">
     <w:name w:val="Colorful List Accent 3"/>
     <w:basedOn w:val="12"/>
+    <w:qFormat/>
     <w:uiPriority w:val="72"/>
     <w:pPr>
       <w:spacing w:after="0" w:line="240" w:lineRule="auto"/>
@@ -14526,6 +14444,7 @@
   <w:style w:type="table" w:styleId="131">
     <w:name w:val="Colorful Grid Accent 3"/>
     <w:basedOn w:val="12"/>
+    <w:qFormat/>
     <w:uiPriority w:val="73"/>
     <w:pPr>
       <w:spacing w:after="0" w:line="240" w:lineRule="auto"/>
@@ -14939,6 +14858,7 @@
     <w:name w:val="Heading 1 Char"/>
     <w:basedOn w:val="11"/>
     <w:link w:val="2"/>
+    <w:qFormat/>
     <w:uiPriority w:val="9"/>
     <w:rPr>
       <w:rFonts w:asciiTheme="majorHAnsi" w:hAnsiTheme="majorHAnsi" w:eastAsiaTheme="majorEastAsia" w:cstheme="majorBidi"/>
@@ -14972,6 +14892,7 @@
     <w:name w:val="Heading 3 Char"/>
     <w:basedOn w:val="11"/>
     <w:link w:val="4"/>
+    <w:qFormat/>
     <w:uiPriority w:val="9"/>
     <w:rPr>
       <w:rFonts w:asciiTheme="majorHAnsi" w:hAnsiTheme="majorHAnsi" w:eastAsiaTheme="majorEastAsia" w:cstheme="majorBidi"/>
@@ -15084,6 +15005,7 @@
     <w:name w:val="Quote Char"/>
     <w:basedOn w:val="11"/>
     <w:link w:val="148"/>
+    <w:qFormat/>
     <w:uiPriority w:val="29"/>
     <w:rPr>
       <w:i/>
@@ -15101,6 +15023,7 @@
     <w:basedOn w:val="11"/>
     <w:link w:val="5"/>
     <w:semiHidden/>
+    <w:qFormat/>
     <w:uiPriority w:val="9"/>
     <w:rPr>
       <w:rFonts w:asciiTheme="majorHAnsi" w:hAnsiTheme="majorHAnsi" w:eastAsiaTheme="majorEastAsia" w:cstheme="majorBidi"/>
@@ -15132,6 +15055,7 @@
     <w:basedOn w:val="11"/>
     <w:link w:val="7"/>
     <w:semiHidden/>
+    <w:qFormat/>
     <w:uiPriority w:val="9"/>
     <w:rPr>
       <w:rFonts w:asciiTheme="majorHAnsi" w:hAnsiTheme="majorHAnsi" w:eastAsiaTheme="majorEastAsia" w:cstheme="majorBidi"/>

</xml_diff>